<commit_message>
fix(issue-39): verify HTTP 403 RBAC API response, enforce strict priority selection, validate attachment content buffer, and update peer review log
</commit_message>
<xml_diff>
--- a/artifacts/lab-04/CPE334_Lab4_Submission_67070503492.docx
+++ b/artifacts/lab-04/CPE334_Lab4_Submission_67070503492.docx
@@ -5614,12 +5614,12 @@
           <wp:inline distB="0" distL="0" distR="0" distT="0">
             <wp:extent cx="5486400" cy="3429000"/>
             <wp:effectExtent b="0" l="0" r="0" t="0"/>
-            <wp:docPr id="2" name="image-83q8td0abkCz6yVxU_wzj.png"/>
+            <wp:docPr id="2" name="image-6lrdd2-IHBCmxxWoMuQVs.png"/>
             <a:graphic>
               <a:graphicData uri="http://schemas.openxmlformats.org/drawingml/2006/picture">
                 <pic:pic>
                   <pic:nvPicPr>
-                    <pic:cNvPr id="2" name="image-83q8td0abkCz6yVxU_wzj.png" descr="Staff Dashboard Desktop"/>
+                    <pic:cNvPr id="2" name="image-6lrdd2-IHBCmxxWoMuQVs.png" descr="Staff Dashboard Desktop"/>
                     <pic:cNvPicPr/>
                   </pic:nvPicPr>
                   <pic:blipFill>
@@ -5662,12 +5662,12 @@
           <wp:inline distB="0" distL="0" distR="0" distT="0">
             <wp:extent cx="5486400" cy="7315200"/>
             <wp:effectExtent b="0" l="0" r="0" t="0"/>
-            <wp:docPr id="4" name="image-9a3SAo5SW2wc9KcUPpxCC.png"/>
+            <wp:docPr id="4" name="image-mAtsSBH8aLfWisuQVBU66.png"/>
             <a:graphic>
               <a:graphicData uri="http://schemas.openxmlformats.org/drawingml/2006/picture">
                 <pic:pic>
                   <pic:nvPicPr>
-                    <pic:cNvPr id="4" name="image-9a3SAo5SW2wc9KcUPpxCC.png" descr="Staff Dashboard Tablet"/>
+                    <pic:cNvPr id="4" name="image-mAtsSBH8aLfWisuQVBU66.png" descr="Staff Dashboard Tablet"/>
                     <pic:cNvPicPr/>
                   </pic:nvPicPr>
                   <pic:blipFill>
@@ -5710,12 +5710,12 @@
           <wp:inline distB="0" distL="0" distR="0" distT="0">
             <wp:extent cx="3571875" cy="6353175"/>
             <wp:effectExtent b="0" l="0" r="0" t="0"/>
-            <wp:docPr id="6" name="image-8jm8PO6_3TOe4ix5KSGiM.png"/>
+            <wp:docPr id="6" name="image-MUgIHnuxds9WDSMEYTn80.png"/>
             <a:graphic>
               <a:graphicData uri="http://schemas.openxmlformats.org/drawingml/2006/picture">
                 <pic:pic>
                   <pic:nvPicPr>
-                    <pic:cNvPr id="6" name="image-8jm8PO6_3TOe4ix5KSGiM.png" descr="Staff Dashboard Mobile"/>
+                    <pic:cNvPr id="6" name="image-MUgIHnuxds9WDSMEYTn80.png" descr="Staff Dashboard Mobile"/>
                     <pic:cNvPicPr/>
                   </pic:nvPicPr>
                   <pic:blipFill>
@@ -5908,12 +5908,12 @@
           <wp:inline distB="0" distL="0" distR="0" distT="0">
             <wp:extent cx="5486400" cy="3429000"/>
             <wp:effectExtent b="0" l="0" r="0" t="0"/>
-            <wp:docPr id="8" name="image-kEwzXEOIVyROuAvej9TQI.png"/>
+            <wp:docPr id="8" name="image-hmXeoKQ39Ca4DiIAIjZ2T.png"/>
             <a:graphic>
               <a:graphicData uri="http://schemas.openxmlformats.org/drawingml/2006/picture">
                 <pic:pic>
                   <pic:nvPicPr>
-                    <pic:cNvPr id="8" name="image-kEwzXEOIVyROuAvej9TQI.png" descr="Actions Taken Desktop"/>
+                    <pic:cNvPr id="8" name="image-hmXeoKQ39Ca4DiIAIjZ2T.png" descr="Actions Taken Desktop"/>
                     <pic:cNvPicPr/>
                   </pic:nvPicPr>
                   <pic:blipFill>
@@ -5956,12 +5956,12 @@
           <wp:inline distB="0" distL="0" distR="0" distT="0">
             <wp:extent cx="5486400" cy="7315200"/>
             <wp:effectExtent b="0" l="0" r="0" t="0"/>
-            <wp:docPr id="10" name="image-aIrM0fGYIIgygUs5L9u0R.png"/>
+            <wp:docPr id="10" name="image-MH8rTdj1kTNJ1ebldkWAy.png"/>
             <a:graphic>
               <a:graphicData uri="http://schemas.openxmlformats.org/drawingml/2006/picture">
                 <pic:pic>
                   <pic:nvPicPr>
-                    <pic:cNvPr id="10" name="image-aIrM0fGYIIgygUs5L9u0R.png" descr="Actions Taken Tablet"/>
+                    <pic:cNvPr id="10" name="image-MH8rTdj1kTNJ1ebldkWAy.png" descr="Actions Taken Tablet"/>
                     <pic:cNvPicPr/>
                   </pic:nvPicPr>
                   <pic:blipFill>
@@ -6004,12 +6004,12 @@
           <wp:inline distB="0" distL="0" distR="0" distT="0">
             <wp:extent cx="3571875" cy="6353175"/>
             <wp:effectExtent b="0" l="0" r="0" t="0"/>
-            <wp:docPr id="12" name="image-r6Jej92uRpXi6fFoaG1ts.png"/>
+            <wp:docPr id="12" name="image-LC6v4JMkHcbbAANCeiDt-.png"/>
             <a:graphic>
               <a:graphicData uri="http://schemas.openxmlformats.org/drawingml/2006/picture">
                 <pic:pic>
                   <pic:nvPicPr>
-                    <pic:cNvPr id="12" name="image-r6Jej92uRpXi6fFoaG1ts.png" descr="Actions Taken Mobile"/>
+                    <pic:cNvPr id="12" name="image-LC6v4JMkHcbbAANCeiDt-.png" descr="Actions Taken Mobile"/>
                     <pic:cNvPicPr/>
                   </pic:nvPicPr>
                   <pic:blipFill>
@@ -6062,12 +6062,12 @@
           <wp:inline distB="0" distL="0" distR="0" distT="0">
             <wp:extent cx="5486400" cy="3429000"/>
             <wp:effectExtent b="0" l="0" r="0" t="0"/>
-            <wp:docPr id="14" name="image-bH90GqJVU28zGy5xXk3gA.png"/>
+            <wp:docPr id="14" name="image-qB-eXQJcvBng4XKJm1nMY.png"/>
             <a:graphic>
               <a:graphicData uri="http://schemas.openxmlformats.org/drawingml/2006/picture">
                 <pic:pic>
                   <pic:nvPicPr>
-                    <pic:cNvPr id="14" name="image-bH90GqJVU28zGy5xXk3gA.png" descr="Action Taken Modal Desktop"/>
+                    <pic:cNvPr id="14" name="image-qB-eXQJcvBng4XKJm1nMY.png" descr="Action Taken Modal Desktop"/>
                     <pic:cNvPicPr/>
                   </pic:nvPicPr>
                   <pic:blipFill>
@@ -6110,12 +6110,12 @@
           <wp:inline distB="0" distL="0" distR="0" distT="0">
             <wp:extent cx="5486400" cy="7315200"/>
             <wp:effectExtent b="0" l="0" r="0" t="0"/>
-            <wp:docPr id="16" name="image-bi_7-2Z0Mc7HrXw0mvCr_.png"/>
+            <wp:docPr id="16" name="image-HjBc0UpQyXm9Ct4DCu5BD.png"/>
             <a:graphic>
               <a:graphicData uri="http://schemas.openxmlformats.org/drawingml/2006/picture">
                 <pic:pic>
                   <pic:nvPicPr>
-                    <pic:cNvPr id="16" name="image-bi_7-2Z0Mc7HrXw0mvCr_.png" descr="Action Taken Modal Tablet"/>
+                    <pic:cNvPr id="16" name="image-HjBc0UpQyXm9Ct4DCu5BD.png" descr="Action Taken Modal Tablet"/>
                     <pic:cNvPicPr/>
                   </pic:nvPicPr>
                   <pic:blipFill>
@@ -6158,12 +6158,12 @@
           <wp:inline distB="0" distL="0" distR="0" distT="0">
             <wp:extent cx="3571875" cy="6353175"/>
             <wp:effectExtent b="0" l="0" r="0" t="0"/>
-            <wp:docPr id="18" name="image-MUYu7Rn2FA8hVFbRHIa6k.png"/>
+            <wp:docPr id="18" name="image-6GUoYsxh-Gp3spzX3mcGT.png"/>
             <a:graphic>
               <a:graphicData uri="http://schemas.openxmlformats.org/drawingml/2006/picture">
                 <pic:pic>
                   <pic:nvPicPr>
-                    <pic:cNvPr id="18" name="image-MUYu7Rn2FA8hVFbRHIa6k.png" descr="Action Taken Modal Mobile"/>
+                    <pic:cNvPr id="18" name="image-6GUoYsxh-Gp3spzX3mcGT.png" descr="Action Taken Modal Mobile"/>
                     <pic:cNvPicPr/>
                   </pic:nvPicPr>
                   <pic:blipFill>
@@ -6324,12 +6324,12 @@
           <wp:inline distB="0" distL="0" distR="0" distT="0">
             <wp:extent cx="5486400" cy="3429000"/>
             <wp:effectExtent b="0" l="0" r="0" t="0"/>
-            <wp:docPr id="20" name="image-P-UBMAtoUGejVuU6LejOg.png"/>
+            <wp:docPr id="20" name="image-EV87LgxjC5Dmf5J269OvC.png"/>
             <a:graphic>
               <a:graphicData uri="http://schemas.openxmlformats.org/drawingml/2006/picture">
                 <pic:pic>
                   <pic:nvPicPr>
-                    <pic:cNvPr id="20" name="image-P-UBMAtoUGejVuU6LejOg.png" descr="Resolution Gate Desktop"/>
+                    <pic:cNvPr id="20" name="image-EV87LgxjC5Dmf5J269OvC.png" descr="Resolution Gate Desktop"/>
                     <pic:cNvPicPr/>
                   </pic:nvPicPr>
                   <pic:blipFill>
@@ -6372,12 +6372,12 @@
           <wp:inline distB="0" distL="0" distR="0" distT="0">
             <wp:extent cx="5486400" cy="7315200"/>
             <wp:effectExtent b="0" l="0" r="0" t="0"/>
-            <wp:docPr id="22" name="image-2Mb7pqTSu-WgaBXErL_N5.png"/>
+            <wp:docPr id="22" name="image-kJF1PM-xa5eVkbiLa71xe.png"/>
             <a:graphic>
               <a:graphicData uri="http://schemas.openxmlformats.org/drawingml/2006/picture">
                 <pic:pic>
                   <pic:nvPicPr>
-                    <pic:cNvPr id="22" name="image-2Mb7pqTSu-WgaBXErL_N5.png" descr="Resolution Gate Tablet"/>
+                    <pic:cNvPr id="22" name="image-kJF1PM-xa5eVkbiLa71xe.png" descr="Resolution Gate Tablet"/>
                     <pic:cNvPicPr/>
                   </pic:nvPicPr>
                   <pic:blipFill>
@@ -6420,12 +6420,12 @@
           <wp:inline distB="0" distL="0" distR="0" distT="0">
             <wp:extent cx="3571875" cy="6353175"/>
             <wp:effectExtent b="0" l="0" r="0" t="0"/>
-            <wp:docPr id="24" name="image-MKVz0fvBGnP_ke2C80TUi.png"/>
+            <wp:docPr id="24" name="image-sKO_76_j2U0OS_BZ20DPk.png"/>
             <a:graphic>
               <a:graphicData uri="http://schemas.openxmlformats.org/drawingml/2006/picture">
                 <pic:pic>
                   <pic:nvPicPr>
-                    <pic:cNvPr id="24" name="image-MKVz0fvBGnP_ke2C80TUi.png" descr="Resolution Gate Mobile"/>
+                    <pic:cNvPr id="24" name="image-sKO_76_j2U0OS_BZ20DPk.png" descr="Resolution Gate Mobile"/>
                     <pic:cNvPicPr/>
                   </pic:nvPicPr>
                   <pic:blipFill>
@@ -6478,12 +6478,12 @@
           <wp:inline distB="0" distL="0" distR="0" distT="0">
             <wp:extent cx="5486400" cy="3429000"/>
             <wp:effectExtent b="0" l="0" r="0" t="0"/>
-            <wp:docPr id="26" name="image-pq3F4CNN5Jku50RK58Nld.png"/>
+            <wp:docPr id="26" name="image-K_resprMkY7MktsZmOt2B.png"/>
             <a:graphic>
               <a:graphicData uri="http://schemas.openxmlformats.org/drawingml/2006/picture">
                 <pic:pic>
                   <pic:nvPicPr>
-                    <pic:cNvPr id="26" name="image-pq3F4CNN5Jku50RK58Nld.png" descr="Requester Resolve Desktop"/>
+                    <pic:cNvPr id="26" name="image-K_resprMkY7MktsZmOt2B.png" descr="Requester Resolve Desktop"/>
                     <pic:cNvPicPr/>
                   </pic:nvPicPr>
                   <pic:blipFill>
@@ -6526,12 +6526,12 @@
           <wp:inline distB="0" distL="0" distR="0" distT="0">
             <wp:extent cx="5486400" cy="7315200"/>
             <wp:effectExtent b="0" l="0" r="0" t="0"/>
-            <wp:docPr id="28" name="image-DHMPAp59KlCzj7FSdgIHw.png"/>
+            <wp:docPr id="28" name="image-TQJXt2a7eWgMkC4jjr_5h.png"/>
             <a:graphic>
               <a:graphicData uri="http://schemas.openxmlformats.org/drawingml/2006/picture">
                 <pic:pic>
                   <pic:nvPicPr>
-                    <pic:cNvPr id="28" name="image-DHMPAp59KlCzj7FSdgIHw.png" descr="Requester Resolve Tablet"/>
+                    <pic:cNvPr id="28" name="image-TQJXt2a7eWgMkC4jjr_5h.png" descr="Requester Resolve Tablet"/>
                     <pic:cNvPicPr/>
                   </pic:nvPicPr>
                   <pic:blipFill>
@@ -6574,12 +6574,12 @@
           <wp:inline distB="0" distL="0" distR="0" distT="0">
             <wp:extent cx="3571875" cy="6353175"/>
             <wp:effectExtent b="0" l="0" r="0" t="0"/>
-            <wp:docPr id="30" name="image-s10U6LSGPmub3PFgTg2sg.png"/>
+            <wp:docPr id="30" name="image-Z0R2EfcIHdUOYp-r6ksgb.png"/>
             <a:graphic>
               <a:graphicData uri="http://schemas.openxmlformats.org/drawingml/2006/picture">
                 <pic:pic>
                   <pic:nvPicPr>
-                    <pic:cNvPr id="30" name="image-s10U6LSGPmub3PFgTg2sg.png" descr="Requester Resolve Mobile"/>
+                    <pic:cNvPr id="30" name="image-Z0R2EfcIHdUOYp-r6ksgb.png" descr="Requester Resolve Mobile"/>
                     <pic:cNvPicPr/>
                   </pic:nvPicPr>
                   <pic:blipFill>
@@ -6632,12 +6632,12 @@
           <wp:inline distB="0" distL="0" distR="0" distT="0">
             <wp:extent cx="5486400" cy="3429000"/>
             <wp:effectExtent b="0" l="0" r="0" t="0"/>
-            <wp:docPr id="32" name="image-y1NFI_geUi2ZqsAkjkz9o.png"/>
+            <wp:docPr id="32" name="image-zKOkJhNM3krJTwjspfeD5.png"/>
             <a:graphic>
               <a:graphicData uri="http://schemas.openxmlformats.org/drawingml/2006/picture">
                 <pic:pic>
                   <pic:nvPicPr>
-                    <pic:cNvPr id="32" name="image-y1NFI_geUi2ZqsAkjkz9o.png" descr="Concurrency Conflict Desktop"/>
+                    <pic:cNvPr id="32" name="image-zKOkJhNM3krJTwjspfeD5.png" descr="Concurrency Conflict Desktop"/>
                     <pic:cNvPicPr/>
                   </pic:nvPicPr>
                   <pic:blipFill>
@@ -6680,12 +6680,12 @@
           <wp:inline distB="0" distL="0" distR="0" distT="0">
             <wp:extent cx="5486400" cy="7315200"/>
             <wp:effectExtent b="0" l="0" r="0" t="0"/>
-            <wp:docPr id="34" name="image-yWFaXUBriUp2ohbRgM3_h.png"/>
+            <wp:docPr id="34" name="image-NgbsOMewC4KkGvLXhnIaa.png"/>
             <a:graphic>
               <a:graphicData uri="http://schemas.openxmlformats.org/drawingml/2006/picture">
                 <pic:pic>
                   <pic:nvPicPr>
-                    <pic:cNvPr id="34" name="image-yWFaXUBriUp2ohbRgM3_h.png" descr="Concurrency Conflict Tablet"/>
+                    <pic:cNvPr id="34" name="image-NgbsOMewC4KkGvLXhnIaa.png" descr="Concurrency Conflict Tablet"/>
                     <pic:cNvPicPr/>
                   </pic:nvPicPr>
                   <pic:blipFill>
@@ -6728,12 +6728,12 @@
           <wp:inline distB="0" distL="0" distR="0" distT="0">
             <wp:extent cx="3571875" cy="6353175"/>
             <wp:effectExtent b="0" l="0" r="0" t="0"/>
-            <wp:docPr id="36" name="image-07qZZOYCZ49ysZLZMkdqK.png"/>
+            <wp:docPr id="36" name="image-XTdqlq9Uy1T5xPE9H9Uq5.png"/>
             <a:graphic>
               <a:graphicData uri="http://schemas.openxmlformats.org/drawingml/2006/picture">
                 <pic:pic>
                   <pic:nvPicPr>
-                    <pic:cNvPr id="36" name="image-07qZZOYCZ49ysZLZMkdqK.png" descr="Concurrency Conflict Mobile"/>
+                    <pic:cNvPr id="36" name="image-XTdqlq9Uy1T5xPE9H9Uq5.png" descr="Concurrency Conflict Mobile"/>
                     <pic:cNvPicPr/>
                   </pic:nvPicPr>
                   <pic:blipFill>
@@ -6805,12 +6805,12 @@
           <wp:inline distB="0" distL="0" distR="0" distT="0">
             <wp:extent cx="5486400" cy="3429000"/>
             <wp:effectExtent b="0" l="0" r="0" t="0"/>
-            <wp:docPr id="38" name="image-aPMFyc-l7Kn51W5pzcCIu.png"/>
+            <wp:docPr id="38" name="image-zS5ofGEbNil4F1ErfqK_x.png"/>
             <a:graphic>
               <a:graphicData uri="http://schemas.openxmlformats.org/drawingml/2006/picture">
                 <pic:pic>
                   <pic:nvPicPr>
-                    <pic:cNvPr id="38" name="image-aPMFyc-l7Kn51W5pzcCIu.png" descr="Requester Dashboard Desktop"/>
+                    <pic:cNvPr id="38" name="image-zS5ofGEbNil4F1ErfqK_x.png" descr="Requester Dashboard Desktop"/>
                     <pic:cNvPicPr/>
                   </pic:nvPicPr>
                   <pic:blipFill>
@@ -6853,12 +6853,12 @@
           <wp:inline distB="0" distL="0" distR="0" distT="0">
             <wp:extent cx="5486400" cy="7315200"/>
             <wp:effectExtent b="0" l="0" r="0" t="0"/>
-            <wp:docPr id="40" name="image-I_k7Nd1CTSRdfOBQ0yUGt.png"/>
+            <wp:docPr id="40" name="image-jmldXsSO0sH6WDtUBPteE.png"/>
             <a:graphic>
               <a:graphicData uri="http://schemas.openxmlformats.org/drawingml/2006/picture">
                 <pic:pic>
                   <pic:nvPicPr>
-                    <pic:cNvPr id="40" name="image-I_k7Nd1CTSRdfOBQ0yUGt.png" descr="Requester Dashboard Tablet"/>
+                    <pic:cNvPr id="40" name="image-jmldXsSO0sH6WDtUBPteE.png" descr="Requester Dashboard Tablet"/>
                     <pic:cNvPicPr/>
                   </pic:nvPicPr>
                   <pic:blipFill>
@@ -6901,12 +6901,12 @@
           <wp:inline distB="0" distL="0" distR="0" distT="0">
             <wp:extent cx="3571875" cy="6353175"/>
             <wp:effectExtent b="0" l="0" r="0" t="0"/>
-            <wp:docPr id="42" name="image-SW4W9iA9O0HRnwJAQAhPe.png"/>
+            <wp:docPr id="42" name="image-JSsqXQ5aAVmRJuR85vk5M.png"/>
             <a:graphic>
               <a:graphicData uri="http://schemas.openxmlformats.org/drawingml/2006/picture">
                 <pic:pic>
                   <pic:nvPicPr>
-                    <pic:cNvPr id="42" name="image-SW4W9iA9O0HRnwJAQAhPe.png" descr="Requester Dashboard Mobile"/>
+                    <pic:cNvPr id="42" name="image-JSsqXQ5aAVmRJuR85vk5M.png" descr="Requester Dashboard Mobile"/>
                     <pic:cNvPicPr/>
                   </pic:nvPicPr>
                   <pic:blipFill>
@@ -6959,12 +6959,12 @@
           <wp:inline distB="0" distL="0" distR="0" distT="0">
             <wp:extent cx="5486400" cy="3429000"/>
             <wp:effectExtent b="0" l="0" r="0" t="0"/>
-            <wp:docPr id="44" name="image-uvLE68w0axdyR3IuHOSEq.png"/>
+            <wp:docPr id="44" name="image-pYsZb00vjcAnnHcZlDgZZ.png"/>
             <a:graphic>
               <a:graphicData uri="http://schemas.openxmlformats.org/drawingml/2006/picture">
                 <pic:pic>
                   <pic:nvPicPr>
-                    <pic:cNvPr id="44" name="image-uvLE68w0axdyR3IuHOSEq.png" descr="Admin Dashboard Desktop"/>
+                    <pic:cNvPr id="44" name="image-pYsZb00vjcAnnHcZlDgZZ.png" descr="Admin Dashboard Desktop"/>
                     <pic:cNvPicPr/>
                   </pic:nvPicPr>
                   <pic:blipFill>
@@ -7007,12 +7007,12 @@
           <wp:inline distB="0" distL="0" distR="0" distT="0">
             <wp:extent cx="5486400" cy="7315200"/>
             <wp:effectExtent b="0" l="0" r="0" t="0"/>
-            <wp:docPr id="46" name="image-of0yDwWGS8XoAPP4tZ2Dr.png"/>
+            <wp:docPr id="46" name="image-f1KfpxIqzGSXa5szh9Yv4.png"/>
             <a:graphic>
               <a:graphicData uri="http://schemas.openxmlformats.org/drawingml/2006/picture">
                 <pic:pic>
                   <pic:nvPicPr>
-                    <pic:cNvPr id="46" name="image-of0yDwWGS8XoAPP4tZ2Dr.png" descr="Admin Dashboard Tablet"/>
+                    <pic:cNvPr id="46" name="image-f1KfpxIqzGSXa5szh9Yv4.png" descr="Admin Dashboard Tablet"/>
                     <pic:cNvPicPr/>
                   </pic:nvPicPr>
                   <pic:blipFill>
@@ -7055,12 +7055,12 @@
           <wp:inline distB="0" distL="0" distR="0" distT="0">
             <wp:extent cx="3571875" cy="6353175"/>
             <wp:effectExtent b="0" l="0" r="0" t="0"/>
-            <wp:docPr id="48" name="image-9QR1_jA0MLGHX7g9HXNJQ.png"/>
+            <wp:docPr id="48" name="image-A_sfYg5J5TM2lpaEEbHsv.png"/>
             <a:graphic>
               <a:graphicData uri="http://schemas.openxmlformats.org/drawingml/2006/picture">
                 <pic:pic>
                   <pic:nvPicPr>
-                    <pic:cNvPr id="48" name="image-9QR1_jA0MLGHX7g9HXNJQ.png" descr="Admin Dashboard Mobile"/>
+                    <pic:cNvPr id="48" name="image-A_sfYg5J5TM2lpaEEbHsv.png" descr="Admin Dashboard Mobile"/>
                     <pic:cNvPicPr/>
                   </pic:nvPicPr>
                   <pic:blipFill>

</xml_diff>

<commit_message>
fix(issue-39): align E2E-07 Bob open ticket count to BR-13, enforce ticket ownership in db-reset, and update reviewer dialogue
</commit_message>
<xml_diff>
--- a/artifacts/lab-04/CPE334_Lab4_Submission_67070503492.docx
+++ b/artifacts/lab-04/CPE334_Lab4_Submission_67070503492.docx
@@ -5614,12 +5614,12 @@
           <wp:inline distB="0" distL="0" distR="0" distT="0">
             <wp:extent cx="5486400" cy="3429000"/>
             <wp:effectExtent b="0" l="0" r="0" t="0"/>
-            <wp:docPr id="2" name="image-rWYm94gUHwD48fgwfci89.png"/>
+            <wp:docPr id="2" name="image-QpgSuXV4ud4H-FMNlXvyL.png"/>
             <a:graphic>
               <a:graphicData uri="http://schemas.openxmlformats.org/drawingml/2006/picture">
                 <pic:pic>
                   <pic:nvPicPr>
-                    <pic:cNvPr id="2" name="image-rWYm94gUHwD48fgwfci89.png" descr="Staff Dashboard Desktop"/>
+                    <pic:cNvPr id="2" name="image-QpgSuXV4ud4H-FMNlXvyL.png" descr="Staff Dashboard Desktop"/>
                     <pic:cNvPicPr/>
                   </pic:nvPicPr>
                   <pic:blipFill>
@@ -5662,12 +5662,12 @@
           <wp:inline distB="0" distL="0" distR="0" distT="0">
             <wp:extent cx="5486400" cy="7315200"/>
             <wp:effectExtent b="0" l="0" r="0" t="0"/>
-            <wp:docPr id="4" name="image-4XGKicladmOpUSW7_rtVt.png"/>
+            <wp:docPr id="4" name="image-o7cjr2_zpuA83jOg685Ik.png"/>
             <a:graphic>
               <a:graphicData uri="http://schemas.openxmlformats.org/drawingml/2006/picture">
                 <pic:pic>
                   <pic:nvPicPr>
-                    <pic:cNvPr id="4" name="image-4XGKicladmOpUSW7_rtVt.png" descr="Staff Dashboard Tablet"/>
+                    <pic:cNvPr id="4" name="image-o7cjr2_zpuA83jOg685Ik.png" descr="Staff Dashboard Tablet"/>
                     <pic:cNvPicPr/>
                   </pic:nvPicPr>
                   <pic:blipFill>
@@ -5710,12 +5710,12 @@
           <wp:inline distB="0" distL="0" distR="0" distT="0">
             <wp:extent cx="3571875" cy="6353175"/>
             <wp:effectExtent b="0" l="0" r="0" t="0"/>
-            <wp:docPr id="6" name="image-sWWIeVqVH5cceGH76ZCoY.png"/>
+            <wp:docPr id="6" name="image-oXmm-qlE-6MMS1T3HgA5M.png"/>
             <a:graphic>
               <a:graphicData uri="http://schemas.openxmlformats.org/drawingml/2006/picture">
                 <pic:pic>
                   <pic:nvPicPr>
-                    <pic:cNvPr id="6" name="image-sWWIeVqVH5cceGH76ZCoY.png" descr="Staff Dashboard Mobile"/>
+                    <pic:cNvPr id="6" name="image-oXmm-qlE-6MMS1T3HgA5M.png" descr="Staff Dashboard Mobile"/>
                     <pic:cNvPicPr/>
                   </pic:nvPicPr>
                   <pic:blipFill>
@@ -5908,12 +5908,12 @@
           <wp:inline distB="0" distL="0" distR="0" distT="0">
             <wp:extent cx="5486400" cy="3429000"/>
             <wp:effectExtent b="0" l="0" r="0" t="0"/>
-            <wp:docPr id="8" name="image--80KTSmHLkTgbr_zJGzex.png"/>
+            <wp:docPr id="8" name="image-8TlKsCA22EMyp-sN7DJob.png"/>
             <a:graphic>
               <a:graphicData uri="http://schemas.openxmlformats.org/drawingml/2006/picture">
                 <pic:pic>
                   <pic:nvPicPr>
-                    <pic:cNvPr id="8" name="image--80KTSmHLkTgbr_zJGzex.png" descr="Actions Taken Desktop"/>
+                    <pic:cNvPr id="8" name="image-8TlKsCA22EMyp-sN7DJob.png" descr="Actions Taken Desktop"/>
                     <pic:cNvPicPr/>
                   </pic:nvPicPr>
                   <pic:blipFill>
@@ -5956,12 +5956,12 @@
           <wp:inline distB="0" distL="0" distR="0" distT="0">
             <wp:extent cx="5486400" cy="7315200"/>
             <wp:effectExtent b="0" l="0" r="0" t="0"/>
-            <wp:docPr id="10" name="image-KAzP8gknscpK9ibxdYvYb.png"/>
+            <wp:docPr id="10" name="image-bc-09Deap4szcryLYG1en.png"/>
             <a:graphic>
               <a:graphicData uri="http://schemas.openxmlformats.org/drawingml/2006/picture">
                 <pic:pic>
                   <pic:nvPicPr>
-                    <pic:cNvPr id="10" name="image-KAzP8gknscpK9ibxdYvYb.png" descr="Actions Taken Tablet"/>
+                    <pic:cNvPr id="10" name="image-bc-09Deap4szcryLYG1en.png" descr="Actions Taken Tablet"/>
                     <pic:cNvPicPr/>
                   </pic:nvPicPr>
                   <pic:blipFill>
@@ -6004,12 +6004,12 @@
           <wp:inline distB="0" distL="0" distR="0" distT="0">
             <wp:extent cx="3571875" cy="6353175"/>
             <wp:effectExtent b="0" l="0" r="0" t="0"/>
-            <wp:docPr id="12" name="image-2oYc3FPkig9KSGmg9KjDV.png"/>
+            <wp:docPr id="12" name="image-udj7emclR0jK3vdqEWVPc.png"/>
             <a:graphic>
               <a:graphicData uri="http://schemas.openxmlformats.org/drawingml/2006/picture">
                 <pic:pic>
                   <pic:nvPicPr>
-                    <pic:cNvPr id="12" name="image-2oYc3FPkig9KSGmg9KjDV.png" descr="Actions Taken Mobile"/>
+                    <pic:cNvPr id="12" name="image-udj7emclR0jK3vdqEWVPc.png" descr="Actions Taken Mobile"/>
                     <pic:cNvPicPr/>
                   </pic:nvPicPr>
                   <pic:blipFill>
@@ -6062,12 +6062,12 @@
           <wp:inline distB="0" distL="0" distR="0" distT="0">
             <wp:extent cx="5486400" cy="3429000"/>
             <wp:effectExtent b="0" l="0" r="0" t="0"/>
-            <wp:docPr id="14" name="image-sKKlpQPAalmuRMp1NUWd9.png"/>
+            <wp:docPr id="14" name="image-o1dBrRrWsjdTNomZT9MTt.png"/>
             <a:graphic>
               <a:graphicData uri="http://schemas.openxmlformats.org/drawingml/2006/picture">
                 <pic:pic>
                   <pic:nvPicPr>
-                    <pic:cNvPr id="14" name="image-sKKlpQPAalmuRMp1NUWd9.png" descr="Action Taken Modal Desktop"/>
+                    <pic:cNvPr id="14" name="image-o1dBrRrWsjdTNomZT9MTt.png" descr="Action Taken Modal Desktop"/>
                     <pic:cNvPicPr/>
                   </pic:nvPicPr>
                   <pic:blipFill>
@@ -6110,12 +6110,12 @@
           <wp:inline distB="0" distL="0" distR="0" distT="0">
             <wp:extent cx="5486400" cy="7315200"/>
             <wp:effectExtent b="0" l="0" r="0" t="0"/>
-            <wp:docPr id="16" name="image-NlUu5sSIAbkAxITATI58P.png"/>
+            <wp:docPr id="16" name="image-U-SSXOvG1AG37MWCOdVFj.png"/>
             <a:graphic>
               <a:graphicData uri="http://schemas.openxmlformats.org/drawingml/2006/picture">
                 <pic:pic>
                   <pic:nvPicPr>
-                    <pic:cNvPr id="16" name="image-NlUu5sSIAbkAxITATI58P.png" descr="Action Taken Modal Tablet"/>
+                    <pic:cNvPr id="16" name="image-U-SSXOvG1AG37MWCOdVFj.png" descr="Action Taken Modal Tablet"/>
                     <pic:cNvPicPr/>
                   </pic:nvPicPr>
                   <pic:blipFill>
@@ -6158,12 +6158,12 @@
           <wp:inline distB="0" distL="0" distR="0" distT="0">
             <wp:extent cx="3571875" cy="6353175"/>
             <wp:effectExtent b="0" l="0" r="0" t="0"/>
-            <wp:docPr id="18" name="image-hxcuJDtOuKDC1o1i7Fze3.png"/>
+            <wp:docPr id="18" name="image-VjF5BdKWQ5n_tS9p37AFV.png"/>
             <a:graphic>
               <a:graphicData uri="http://schemas.openxmlformats.org/drawingml/2006/picture">
                 <pic:pic>
                   <pic:nvPicPr>
-                    <pic:cNvPr id="18" name="image-hxcuJDtOuKDC1o1i7Fze3.png" descr="Action Taken Modal Mobile"/>
+                    <pic:cNvPr id="18" name="image-VjF5BdKWQ5n_tS9p37AFV.png" descr="Action Taken Modal Mobile"/>
                     <pic:cNvPicPr/>
                   </pic:nvPicPr>
                   <pic:blipFill>
@@ -6324,12 +6324,12 @@
           <wp:inline distB="0" distL="0" distR="0" distT="0">
             <wp:extent cx="5486400" cy="3429000"/>
             <wp:effectExtent b="0" l="0" r="0" t="0"/>
-            <wp:docPr id="20" name="image-nSWYz9tCQe7e3tkoeZzrX.png"/>
+            <wp:docPr id="20" name="image-AAHWJu1v2Ie1FCFhg50ud.png"/>
             <a:graphic>
               <a:graphicData uri="http://schemas.openxmlformats.org/drawingml/2006/picture">
                 <pic:pic>
                   <pic:nvPicPr>
-                    <pic:cNvPr id="20" name="image-nSWYz9tCQe7e3tkoeZzrX.png" descr="Resolution Gate Desktop"/>
+                    <pic:cNvPr id="20" name="image-AAHWJu1v2Ie1FCFhg50ud.png" descr="Resolution Gate Desktop"/>
                     <pic:cNvPicPr/>
                   </pic:nvPicPr>
                   <pic:blipFill>
@@ -6372,12 +6372,12 @@
           <wp:inline distB="0" distL="0" distR="0" distT="0">
             <wp:extent cx="5486400" cy="7315200"/>
             <wp:effectExtent b="0" l="0" r="0" t="0"/>
-            <wp:docPr id="22" name="image-6j-e2CYlEDUd5UiUhfuAM.png"/>
+            <wp:docPr id="22" name="image-03WLXOFXSlQKOmV9UFWUC.png"/>
             <a:graphic>
               <a:graphicData uri="http://schemas.openxmlformats.org/drawingml/2006/picture">
                 <pic:pic>
                   <pic:nvPicPr>
-                    <pic:cNvPr id="22" name="image-6j-e2CYlEDUd5UiUhfuAM.png" descr="Resolution Gate Tablet"/>
+                    <pic:cNvPr id="22" name="image-03WLXOFXSlQKOmV9UFWUC.png" descr="Resolution Gate Tablet"/>
                     <pic:cNvPicPr/>
                   </pic:nvPicPr>
                   <pic:blipFill>
@@ -6420,12 +6420,12 @@
           <wp:inline distB="0" distL="0" distR="0" distT="0">
             <wp:extent cx="3571875" cy="6353175"/>
             <wp:effectExtent b="0" l="0" r="0" t="0"/>
-            <wp:docPr id="24" name="image-iY-XqDFB9ClE95aNVIEs9.png"/>
+            <wp:docPr id="24" name="image-cDqi20lSvqtPP_vr7d0at.png"/>
             <a:graphic>
               <a:graphicData uri="http://schemas.openxmlformats.org/drawingml/2006/picture">
                 <pic:pic>
                   <pic:nvPicPr>
-                    <pic:cNvPr id="24" name="image-iY-XqDFB9ClE95aNVIEs9.png" descr="Resolution Gate Mobile"/>
+                    <pic:cNvPr id="24" name="image-cDqi20lSvqtPP_vr7d0at.png" descr="Resolution Gate Mobile"/>
                     <pic:cNvPicPr/>
                   </pic:nvPicPr>
                   <pic:blipFill>
@@ -6478,12 +6478,12 @@
           <wp:inline distB="0" distL="0" distR="0" distT="0">
             <wp:extent cx="5486400" cy="3429000"/>
             <wp:effectExtent b="0" l="0" r="0" t="0"/>
-            <wp:docPr id="26" name="image-D7FIXSc5hZNCwcc64wGqN.png"/>
+            <wp:docPr id="26" name="image-A_0gWRsoDFfd8QWHA9fjm.png"/>
             <a:graphic>
               <a:graphicData uri="http://schemas.openxmlformats.org/drawingml/2006/picture">
                 <pic:pic>
                   <pic:nvPicPr>
-                    <pic:cNvPr id="26" name="image-D7FIXSc5hZNCwcc64wGqN.png" descr="Requester Resolve Desktop"/>
+                    <pic:cNvPr id="26" name="image-A_0gWRsoDFfd8QWHA9fjm.png" descr="Requester Resolve Desktop"/>
                     <pic:cNvPicPr/>
                   </pic:nvPicPr>
                   <pic:blipFill>
@@ -6526,12 +6526,12 @@
           <wp:inline distB="0" distL="0" distR="0" distT="0">
             <wp:extent cx="5486400" cy="7315200"/>
             <wp:effectExtent b="0" l="0" r="0" t="0"/>
-            <wp:docPr id="28" name="image-2mCRmym_tuMdOdJ3wxCuo.png"/>
+            <wp:docPr id="28" name="image-FLN3fMYskqj1MquRlbIo9.png"/>
             <a:graphic>
               <a:graphicData uri="http://schemas.openxmlformats.org/drawingml/2006/picture">
                 <pic:pic>
                   <pic:nvPicPr>
-                    <pic:cNvPr id="28" name="image-2mCRmym_tuMdOdJ3wxCuo.png" descr="Requester Resolve Tablet"/>
+                    <pic:cNvPr id="28" name="image-FLN3fMYskqj1MquRlbIo9.png" descr="Requester Resolve Tablet"/>
                     <pic:cNvPicPr/>
                   </pic:nvPicPr>
                   <pic:blipFill>
@@ -6574,12 +6574,12 @@
           <wp:inline distB="0" distL="0" distR="0" distT="0">
             <wp:extent cx="3571875" cy="6353175"/>
             <wp:effectExtent b="0" l="0" r="0" t="0"/>
-            <wp:docPr id="30" name="image-hrr7O3IWTOM6AQwegYK_T.png"/>
+            <wp:docPr id="30" name="image-S_jvEhm592CODblElq7mi.png"/>
             <a:graphic>
               <a:graphicData uri="http://schemas.openxmlformats.org/drawingml/2006/picture">
                 <pic:pic>
                   <pic:nvPicPr>
-                    <pic:cNvPr id="30" name="image-hrr7O3IWTOM6AQwegYK_T.png" descr="Requester Resolve Mobile"/>
+                    <pic:cNvPr id="30" name="image-S_jvEhm592CODblElq7mi.png" descr="Requester Resolve Mobile"/>
                     <pic:cNvPicPr/>
                   </pic:nvPicPr>
                   <pic:blipFill>
@@ -6632,12 +6632,12 @@
           <wp:inline distB="0" distL="0" distR="0" distT="0">
             <wp:extent cx="5486400" cy="3429000"/>
             <wp:effectExtent b="0" l="0" r="0" t="0"/>
-            <wp:docPr id="32" name="image-mv3LiGKW381OnhVQCOFVH.png"/>
+            <wp:docPr id="32" name="image-JWyxJZ3TErrHI-NZh3VGQ.png"/>
             <a:graphic>
               <a:graphicData uri="http://schemas.openxmlformats.org/drawingml/2006/picture">
                 <pic:pic>
                   <pic:nvPicPr>
-                    <pic:cNvPr id="32" name="image-mv3LiGKW381OnhVQCOFVH.png" descr="Concurrency Conflict Desktop"/>
+                    <pic:cNvPr id="32" name="image-JWyxJZ3TErrHI-NZh3VGQ.png" descr="Concurrency Conflict Desktop"/>
                     <pic:cNvPicPr/>
                   </pic:nvPicPr>
                   <pic:blipFill>
@@ -6680,12 +6680,12 @@
           <wp:inline distB="0" distL="0" distR="0" distT="0">
             <wp:extent cx="5486400" cy="7315200"/>
             <wp:effectExtent b="0" l="0" r="0" t="0"/>
-            <wp:docPr id="34" name="image-N2u0PspqeOMx-3pqEwO1t.png"/>
+            <wp:docPr id="34" name="image-4ggVxp-mgO0FFh8OrhXaL.png"/>
             <a:graphic>
               <a:graphicData uri="http://schemas.openxmlformats.org/drawingml/2006/picture">
                 <pic:pic>
                   <pic:nvPicPr>
-                    <pic:cNvPr id="34" name="image-N2u0PspqeOMx-3pqEwO1t.png" descr="Concurrency Conflict Tablet"/>
+                    <pic:cNvPr id="34" name="image-4ggVxp-mgO0FFh8OrhXaL.png" descr="Concurrency Conflict Tablet"/>
                     <pic:cNvPicPr/>
                   </pic:nvPicPr>
                   <pic:blipFill>
@@ -6728,12 +6728,12 @@
           <wp:inline distB="0" distL="0" distR="0" distT="0">
             <wp:extent cx="3571875" cy="6353175"/>
             <wp:effectExtent b="0" l="0" r="0" t="0"/>
-            <wp:docPr id="36" name="image-aa65_z1tXJNUgg9F8iowH.png"/>
+            <wp:docPr id="36" name="image-doxZ7yCHR3dxE9nMesid5.png"/>
             <a:graphic>
               <a:graphicData uri="http://schemas.openxmlformats.org/drawingml/2006/picture">
                 <pic:pic>
                   <pic:nvPicPr>
-                    <pic:cNvPr id="36" name="image-aa65_z1tXJNUgg9F8iowH.png" descr="Concurrency Conflict Mobile"/>
+                    <pic:cNvPr id="36" name="image-doxZ7yCHR3dxE9nMesid5.png" descr="Concurrency Conflict Mobile"/>
                     <pic:cNvPicPr/>
                   </pic:nvPicPr>
                   <pic:blipFill>
@@ -6805,12 +6805,12 @@
           <wp:inline distB="0" distL="0" distR="0" distT="0">
             <wp:extent cx="5486400" cy="3429000"/>
             <wp:effectExtent b="0" l="0" r="0" t="0"/>
-            <wp:docPr id="38" name="image-_1G2HuYw995V25lpo5q1M.png"/>
+            <wp:docPr id="38" name="image-pXZApTLqj6IVkODrMAUpl.png"/>
             <a:graphic>
               <a:graphicData uri="http://schemas.openxmlformats.org/drawingml/2006/picture">
                 <pic:pic>
                   <pic:nvPicPr>
-                    <pic:cNvPr id="38" name="image-_1G2HuYw995V25lpo5q1M.png" descr="Requester Dashboard Desktop"/>
+                    <pic:cNvPr id="38" name="image-pXZApTLqj6IVkODrMAUpl.png" descr="Requester Dashboard Desktop"/>
                     <pic:cNvPicPr/>
                   </pic:nvPicPr>
                   <pic:blipFill>
@@ -6853,12 +6853,12 @@
           <wp:inline distB="0" distL="0" distR="0" distT="0">
             <wp:extent cx="5486400" cy="7315200"/>
             <wp:effectExtent b="0" l="0" r="0" t="0"/>
-            <wp:docPr id="40" name="image-GY6TU0CZnDcW3x7N8ZPOd.png"/>
+            <wp:docPr id="40" name="image-tV9WJYG-2GfjuJgn8CXyn.png"/>
             <a:graphic>
               <a:graphicData uri="http://schemas.openxmlformats.org/drawingml/2006/picture">
                 <pic:pic>
                   <pic:nvPicPr>
-                    <pic:cNvPr id="40" name="image-GY6TU0CZnDcW3x7N8ZPOd.png" descr="Requester Dashboard Tablet"/>
+                    <pic:cNvPr id="40" name="image-tV9WJYG-2GfjuJgn8CXyn.png" descr="Requester Dashboard Tablet"/>
                     <pic:cNvPicPr/>
                   </pic:nvPicPr>
                   <pic:blipFill>
@@ -6901,12 +6901,12 @@
           <wp:inline distB="0" distL="0" distR="0" distT="0">
             <wp:extent cx="3571875" cy="6353175"/>
             <wp:effectExtent b="0" l="0" r="0" t="0"/>
-            <wp:docPr id="42" name="image-UVnImUFhNXdh3tv8XOrAR.png"/>
+            <wp:docPr id="42" name="image-ybTC9k_qeQtBzbTasU0FF.png"/>
             <a:graphic>
               <a:graphicData uri="http://schemas.openxmlformats.org/drawingml/2006/picture">
                 <pic:pic>
                   <pic:nvPicPr>
-                    <pic:cNvPr id="42" name="image-UVnImUFhNXdh3tv8XOrAR.png" descr="Requester Dashboard Mobile"/>
+                    <pic:cNvPr id="42" name="image-ybTC9k_qeQtBzbTasU0FF.png" descr="Requester Dashboard Mobile"/>
                     <pic:cNvPicPr/>
                   </pic:nvPicPr>
                   <pic:blipFill>
@@ -6959,12 +6959,12 @@
           <wp:inline distB="0" distL="0" distR="0" distT="0">
             <wp:extent cx="5486400" cy="3429000"/>
             <wp:effectExtent b="0" l="0" r="0" t="0"/>
-            <wp:docPr id="44" name="image-CrHrrmBAI61AudaeAg5mj.png"/>
+            <wp:docPr id="44" name="image-jMJLrqpsnVxCH-UruZmKQ.png"/>
             <a:graphic>
               <a:graphicData uri="http://schemas.openxmlformats.org/drawingml/2006/picture">
                 <pic:pic>
                   <pic:nvPicPr>
-                    <pic:cNvPr id="44" name="image-CrHrrmBAI61AudaeAg5mj.png" descr="Admin Dashboard Desktop"/>
+                    <pic:cNvPr id="44" name="image-jMJLrqpsnVxCH-UruZmKQ.png" descr="Admin Dashboard Desktop"/>
                     <pic:cNvPicPr/>
                   </pic:nvPicPr>
                   <pic:blipFill>
@@ -7007,12 +7007,12 @@
           <wp:inline distB="0" distL="0" distR="0" distT="0">
             <wp:extent cx="5486400" cy="7315200"/>
             <wp:effectExtent b="0" l="0" r="0" t="0"/>
-            <wp:docPr id="46" name="image-VVeGL01QpD7e9CObUm71A.png"/>
+            <wp:docPr id="46" name="image-niK-2gxq2TH0nzhUTYuAG.png"/>
             <a:graphic>
               <a:graphicData uri="http://schemas.openxmlformats.org/drawingml/2006/picture">
                 <pic:pic>
                   <pic:nvPicPr>
-                    <pic:cNvPr id="46" name="image-VVeGL01QpD7e9CObUm71A.png" descr="Admin Dashboard Tablet"/>
+                    <pic:cNvPr id="46" name="image-niK-2gxq2TH0nzhUTYuAG.png" descr="Admin Dashboard Tablet"/>
                     <pic:cNvPicPr/>
                   </pic:nvPicPr>
                   <pic:blipFill>
@@ -7055,12 +7055,12 @@
           <wp:inline distB="0" distL="0" distR="0" distT="0">
             <wp:extent cx="3571875" cy="6353175"/>
             <wp:effectExtent b="0" l="0" r="0" t="0"/>
-            <wp:docPr id="48" name="image-sEsLI5SSz3FnWOpT219Cx.png"/>
+            <wp:docPr id="48" name="image-Xp1bVbuYpsiEl3MuNpQs-.png"/>
             <a:graphic>
               <a:graphicData uri="http://schemas.openxmlformats.org/drawingml/2006/picture">
                 <pic:pic>
                   <pic:nvPicPr>
-                    <pic:cNvPr id="48" name="image-sEsLI5SSz3FnWOpT219Cx.png" descr="Admin Dashboard Mobile"/>
+                    <pic:cNvPr id="48" name="image-Xp1bVbuYpsiEl3MuNpQs-.png" descr="Admin Dashboard Mobile"/>
                     <pic:cNvPicPr/>
                   </pic:nvPicPr>
                   <pic:blipFill>

</xml_diff>

<commit_message>
docs(submission): align seed account names in HTML submission package to README
</commit_message>
<xml_diff>
--- a/artifacts/lab-04/CPE334_Lab4_Submission_67070503492.docx
+++ b/artifacts/lab-04/CPE334_Lab4_Submission_67070503492.docx
@@ -1538,7 +1538,7 @@
       </w:r>
       <w:r>
         <w:rPr/>
-        <w:t xml:space="preserve"> with comprehensive Sprint 4 feature descriptions, live seed account credentials (Alice, Bob, David, Carol, Eve), test execution instructions, and complete </w:t>
+        <w:t xml:space="preserve"> with comprehensive Sprint 4 feature descriptions, live seed account credentials (Alice, Bob, Michael, David, John), test execution instructions, and complete </w:t>
       </w:r>
       <w:r>
         <w:rPr/>
@@ -5614,12 +5614,12 @@
           <wp:inline distB="0" distL="0" distR="0" distT="0">
             <wp:extent cx="5486400" cy="3429000"/>
             <wp:effectExtent b="0" l="0" r="0" t="0"/>
-            <wp:docPr id="2" name="image-QpgSuXV4ud4H-FMNlXvyL.png"/>
+            <wp:docPr id="2" name="image-yQ5-Kr6cqnuuDanWCbDZO.png"/>
             <a:graphic>
               <a:graphicData uri="http://schemas.openxmlformats.org/drawingml/2006/picture">
                 <pic:pic>
                   <pic:nvPicPr>
-                    <pic:cNvPr id="2" name="image-QpgSuXV4ud4H-FMNlXvyL.png" descr="Staff Dashboard Desktop"/>
+                    <pic:cNvPr id="2" name="image-yQ5-Kr6cqnuuDanWCbDZO.png" descr="Staff Dashboard Desktop"/>
                     <pic:cNvPicPr/>
                   </pic:nvPicPr>
                   <pic:blipFill>
@@ -5662,12 +5662,12 @@
           <wp:inline distB="0" distL="0" distR="0" distT="0">
             <wp:extent cx="5486400" cy="7315200"/>
             <wp:effectExtent b="0" l="0" r="0" t="0"/>
-            <wp:docPr id="4" name="image-o7cjr2_zpuA83jOg685Ik.png"/>
+            <wp:docPr id="4" name="image-HVmS7-loHaaWTzIoDDqoM.png"/>
             <a:graphic>
               <a:graphicData uri="http://schemas.openxmlformats.org/drawingml/2006/picture">
                 <pic:pic>
                   <pic:nvPicPr>
-                    <pic:cNvPr id="4" name="image-o7cjr2_zpuA83jOg685Ik.png" descr="Staff Dashboard Tablet"/>
+                    <pic:cNvPr id="4" name="image-HVmS7-loHaaWTzIoDDqoM.png" descr="Staff Dashboard Tablet"/>
                     <pic:cNvPicPr/>
                   </pic:nvPicPr>
                   <pic:blipFill>
@@ -5710,12 +5710,12 @@
           <wp:inline distB="0" distL="0" distR="0" distT="0">
             <wp:extent cx="3571875" cy="6353175"/>
             <wp:effectExtent b="0" l="0" r="0" t="0"/>
-            <wp:docPr id="6" name="image-oXmm-qlE-6MMS1T3HgA5M.png"/>
+            <wp:docPr id="6" name="image-hG_bQjTnSP14dUtS8CwVC.png"/>
             <a:graphic>
               <a:graphicData uri="http://schemas.openxmlformats.org/drawingml/2006/picture">
                 <pic:pic>
                   <pic:nvPicPr>
-                    <pic:cNvPr id="6" name="image-oXmm-qlE-6MMS1T3HgA5M.png" descr="Staff Dashboard Mobile"/>
+                    <pic:cNvPr id="6" name="image-hG_bQjTnSP14dUtS8CwVC.png" descr="Staff Dashboard Mobile"/>
                     <pic:cNvPicPr/>
                   </pic:nvPicPr>
                   <pic:blipFill>
@@ -5908,12 +5908,12 @@
           <wp:inline distB="0" distL="0" distR="0" distT="0">
             <wp:extent cx="5486400" cy="3429000"/>
             <wp:effectExtent b="0" l="0" r="0" t="0"/>
-            <wp:docPr id="8" name="image-8TlKsCA22EMyp-sN7DJob.png"/>
+            <wp:docPr id="8" name="image-WEx_Nlic4kM0LJ8i9-P5n.png"/>
             <a:graphic>
               <a:graphicData uri="http://schemas.openxmlformats.org/drawingml/2006/picture">
                 <pic:pic>
                   <pic:nvPicPr>
-                    <pic:cNvPr id="8" name="image-8TlKsCA22EMyp-sN7DJob.png" descr="Actions Taken Desktop"/>
+                    <pic:cNvPr id="8" name="image-WEx_Nlic4kM0LJ8i9-P5n.png" descr="Actions Taken Desktop"/>
                     <pic:cNvPicPr/>
                   </pic:nvPicPr>
                   <pic:blipFill>
@@ -5956,12 +5956,12 @@
           <wp:inline distB="0" distL="0" distR="0" distT="0">
             <wp:extent cx="5486400" cy="7315200"/>
             <wp:effectExtent b="0" l="0" r="0" t="0"/>
-            <wp:docPr id="10" name="image-bc-09Deap4szcryLYG1en.png"/>
+            <wp:docPr id="10" name="image-rg3G0DrjEaKmX5YSgh9xN.png"/>
             <a:graphic>
               <a:graphicData uri="http://schemas.openxmlformats.org/drawingml/2006/picture">
                 <pic:pic>
                   <pic:nvPicPr>
-                    <pic:cNvPr id="10" name="image-bc-09Deap4szcryLYG1en.png" descr="Actions Taken Tablet"/>
+                    <pic:cNvPr id="10" name="image-rg3G0DrjEaKmX5YSgh9xN.png" descr="Actions Taken Tablet"/>
                     <pic:cNvPicPr/>
                   </pic:nvPicPr>
                   <pic:blipFill>
@@ -6004,12 +6004,12 @@
           <wp:inline distB="0" distL="0" distR="0" distT="0">
             <wp:extent cx="3571875" cy="6353175"/>
             <wp:effectExtent b="0" l="0" r="0" t="0"/>
-            <wp:docPr id="12" name="image-udj7emclR0jK3vdqEWVPc.png"/>
+            <wp:docPr id="12" name="image-7oSbpBkHNo1a988Pl7p2v.png"/>
             <a:graphic>
               <a:graphicData uri="http://schemas.openxmlformats.org/drawingml/2006/picture">
                 <pic:pic>
                   <pic:nvPicPr>
-                    <pic:cNvPr id="12" name="image-udj7emclR0jK3vdqEWVPc.png" descr="Actions Taken Mobile"/>
+                    <pic:cNvPr id="12" name="image-7oSbpBkHNo1a988Pl7p2v.png" descr="Actions Taken Mobile"/>
                     <pic:cNvPicPr/>
                   </pic:nvPicPr>
                   <pic:blipFill>
@@ -6062,12 +6062,12 @@
           <wp:inline distB="0" distL="0" distR="0" distT="0">
             <wp:extent cx="5486400" cy="3429000"/>
             <wp:effectExtent b="0" l="0" r="0" t="0"/>
-            <wp:docPr id="14" name="image-o1dBrRrWsjdTNomZT9MTt.png"/>
+            <wp:docPr id="14" name="image-scsBr5NKiLNRXhOGaCssC.png"/>
             <a:graphic>
               <a:graphicData uri="http://schemas.openxmlformats.org/drawingml/2006/picture">
                 <pic:pic>
                   <pic:nvPicPr>
-                    <pic:cNvPr id="14" name="image-o1dBrRrWsjdTNomZT9MTt.png" descr="Action Taken Modal Desktop"/>
+                    <pic:cNvPr id="14" name="image-scsBr5NKiLNRXhOGaCssC.png" descr="Action Taken Modal Desktop"/>
                     <pic:cNvPicPr/>
                   </pic:nvPicPr>
                   <pic:blipFill>
@@ -6110,12 +6110,12 @@
           <wp:inline distB="0" distL="0" distR="0" distT="0">
             <wp:extent cx="5486400" cy="7315200"/>
             <wp:effectExtent b="0" l="0" r="0" t="0"/>
-            <wp:docPr id="16" name="image-U-SSXOvG1AG37MWCOdVFj.png"/>
+            <wp:docPr id="16" name="image-OdHsnTRdLcGn9qLe6npNe.png"/>
             <a:graphic>
               <a:graphicData uri="http://schemas.openxmlformats.org/drawingml/2006/picture">
                 <pic:pic>
                   <pic:nvPicPr>
-                    <pic:cNvPr id="16" name="image-U-SSXOvG1AG37MWCOdVFj.png" descr="Action Taken Modal Tablet"/>
+                    <pic:cNvPr id="16" name="image-OdHsnTRdLcGn9qLe6npNe.png" descr="Action Taken Modal Tablet"/>
                     <pic:cNvPicPr/>
                   </pic:nvPicPr>
                   <pic:blipFill>
@@ -6158,12 +6158,12 @@
           <wp:inline distB="0" distL="0" distR="0" distT="0">
             <wp:extent cx="3571875" cy="6353175"/>
             <wp:effectExtent b="0" l="0" r="0" t="0"/>
-            <wp:docPr id="18" name="image-VjF5BdKWQ5n_tS9p37AFV.png"/>
+            <wp:docPr id="18" name="image-SR2YhGW5jq-V45VfM-erP.png"/>
             <a:graphic>
               <a:graphicData uri="http://schemas.openxmlformats.org/drawingml/2006/picture">
                 <pic:pic>
                   <pic:nvPicPr>
-                    <pic:cNvPr id="18" name="image-VjF5BdKWQ5n_tS9p37AFV.png" descr="Action Taken Modal Mobile"/>
+                    <pic:cNvPr id="18" name="image-SR2YhGW5jq-V45VfM-erP.png" descr="Action Taken Modal Mobile"/>
                     <pic:cNvPicPr/>
                   </pic:nvPicPr>
                   <pic:blipFill>
@@ -6324,12 +6324,12 @@
           <wp:inline distB="0" distL="0" distR="0" distT="0">
             <wp:extent cx="5486400" cy="3429000"/>
             <wp:effectExtent b="0" l="0" r="0" t="0"/>
-            <wp:docPr id="20" name="image-AAHWJu1v2Ie1FCFhg50ud.png"/>
+            <wp:docPr id="20" name="image-tYlfWTpTGM2qVczhtAVKL.png"/>
             <a:graphic>
               <a:graphicData uri="http://schemas.openxmlformats.org/drawingml/2006/picture">
                 <pic:pic>
                   <pic:nvPicPr>
-                    <pic:cNvPr id="20" name="image-AAHWJu1v2Ie1FCFhg50ud.png" descr="Resolution Gate Desktop"/>
+                    <pic:cNvPr id="20" name="image-tYlfWTpTGM2qVczhtAVKL.png" descr="Resolution Gate Desktop"/>
                     <pic:cNvPicPr/>
                   </pic:nvPicPr>
                   <pic:blipFill>
@@ -6372,12 +6372,12 @@
           <wp:inline distB="0" distL="0" distR="0" distT="0">
             <wp:extent cx="5486400" cy="7315200"/>
             <wp:effectExtent b="0" l="0" r="0" t="0"/>
-            <wp:docPr id="22" name="image-03WLXOFXSlQKOmV9UFWUC.png"/>
+            <wp:docPr id="22" name="image-cOzrDMH9_Qffp_NTzyvth.png"/>
             <a:graphic>
               <a:graphicData uri="http://schemas.openxmlformats.org/drawingml/2006/picture">
                 <pic:pic>
                   <pic:nvPicPr>
-                    <pic:cNvPr id="22" name="image-03WLXOFXSlQKOmV9UFWUC.png" descr="Resolution Gate Tablet"/>
+                    <pic:cNvPr id="22" name="image-cOzrDMH9_Qffp_NTzyvth.png" descr="Resolution Gate Tablet"/>
                     <pic:cNvPicPr/>
                   </pic:nvPicPr>
                   <pic:blipFill>
@@ -6420,12 +6420,12 @@
           <wp:inline distB="0" distL="0" distR="0" distT="0">
             <wp:extent cx="3571875" cy="6353175"/>
             <wp:effectExtent b="0" l="0" r="0" t="0"/>
-            <wp:docPr id="24" name="image-cDqi20lSvqtPP_vr7d0at.png"/>
+            <wp:docPr id="24" name="image-9qbSVQ53vUU0a882yROLM.png"/>
             <a:graphic>
               <a:graphicData uri="http://schemas.openxmlformats.org/drawingml/2006/picture">
                 <pic:pic>
                   <pic:nvPicPr>
-                    <pic:cNvPr id="24" name="image-cDqi20lSvqtPP_vr7d0at.png" descr="Resolution Gate Mobile"/>
+                    <pic:cNvPr id="24" name="image-9qbSVQ53vUU0a882yROLM.png" descr="Resolution Gate Mobile"/>
                     <pic:cNvPicPr/>
                   </pic:nvPicPr>
                   <pic:blipFill>
@@ -6478,12 +6478,12 @@
           <wp:inline distB="0" distL="0" distR="0" distT="0">
             <wp:extent cx="5486400" cy="3429000"/>
             <wp:effectExtent b="0" l="0" r="0" t="0"/>
-            <wp:docPr id="26" name="image-A_0gWRsoDFfd8QWHA9fjm.png"/>
+            <wp:docPr id="26" name="image-l_x_yEL_y6nSHUzlNRmZg.png"/>
             <a:graphic>
               <a:graphicData uri="http://schemas.openxmlformats.org/drawingml/2006/picture">
                 <pic:pic>
                   <pic:nvPicPr>
-                    <pic:cNvPr id="26" name="image-A_0gWRsoDFfd8QWHA9fjm.png" descr="Requester Resolve Desktop"/>
+                    <pic:cNvPr id="26" name="image-l_x_yEL_y6nSHUzlNRmZg.png" descr="Requester Resolve Desktop"/>
                     <pic:cNvPicPr/>
                   </pic:nvPicPr>
                   <pic:blipFill>
@@ -6526,12 +6526,12 @@
           <wp:inline distB="0" distL="0" distR="0" distT="0">
             <wp:extent cx="5486400" cy="7315200"/>
             <wp:effectExtent b="0" l="0" r="0" t="0"/>
-            <wp:docPr id="28" name="image-FLN3fMYskqj1MquRlbIo9.png"/>
+            <wp:docPr id="28" name="image-9C04bSqicY2Tg8RRMspwA.png"/>
             <a:graphic>
               <a:graphicData uri="http://schemas.openxmlformats.org/drawingml/2006/picture">
                 <pic:pic>
                   <pic:nvPicPr>
-                    <pic:cNvPr id="28" name="image-FLN3fMYskqj1MquRlbIo9.png" descr="Requester Resolve Tablet"/>
+                    <pic:cNvPr id="28" name="image-9C04bSqicY2Tg8RRMspwA.png" descr="Requester Resolve Tablet"/>
                     <pic:cNvPicPr/>
                   </pic:nvPicPr>
                   <pic:blipFill>
@@ -6574,12 +6574,12 @@
           <wp:inline distB="0" distL="0" distR="0" distT="0">
             <wp:extent cx="3571875" cy="6353175"/>
             <wp:effectExtent b="0" l="0" r="0" t="0"/>
-            <wp:docPr id="30" name="image-S_jvEhm592CODblElq7mi.png"/>
+            <wp:docPr id="30" name="image-Kn4fbWJk3alM0iQdgvBS-.png"/>
             <a:graphic>
               <a:graphicData uri="http://schemas.openxmlformats.org/drawingml/2006/picture">
                 <pic:pic>
                   <pic:nvPicPr>
-                    <pic:cNvPr id="30" name="image-S_jvEhm592CODblElq7mi.png" descr="Requester Resolve Mobile"/>
+                    <pic:cNvPr id="30" name="image-Kn4fbWJk3alM0iQdgvBS-.png" descr="Requester Resolve Mobile"/>
                     <pic:cNvPicPr/>
                   </pic:nvPicPr>
                   <pic:blipFill>
@@ -6632,12 +6632,12 @@
           <wp:inline distB="0" distL="0" distR="0" distT="0">
             <wp:extent cx="5486400" cy="3429000"/>
             <wp:effectExtent b="0" l="0" r="0" t="0"/>
-            <wp:docPr id="32" name="image-JWyxJZ3TErrHI-NZh3VGQ.png"/>
+            <wp:docPr id="32" name="image-0C2yV7ZxUoFbyBz62qTlN.png"/>
             <a:graphic>
               <a:graphicData uri="http://schemas.openxmlformats.org/drawingml/2006/picture">
                 <pic:pic>
                   <pic:nvPicPr>
-                    <pic:cNvPr id="32" name="image-JWyxJZ3TErrHI-NZh3VGQ.png" descr="Concurrency Conflict Desktop"/>
+                    <pic:cNvPr id="32" name="image-0C2yV7ZxUoFbyBz62qTlN.png" descr="Concurrency Conflict Desktop"/>
                     <pic:cNvPicPr/>
                   </pic:nvPicPr>
                   <pic:blipFill>
@@ -6680,12 +6680,12 @@
           <wp:inline distB="0" distL="0" distR="0" distT="0">
             <wp:extent cx="5486400" cy="7315200"/>
             <wp:effectExtent b="0" l="0" r="0" t="0"/>
-            <wp:docPr id="34" name="image-4ggVxp-mgO0FFh8OrhXaL.png"/>
+            <wp:docPr id="34" name="image-qL_gvi8uimh1T0fCldXhK.png"/>
             <a:graphic>
               <a:graphicData uri="http://schemas.openxmlformats.org/drawingml/2006/picture">
                 <pic:pic>
                   <pic:nvPicPr>
-                    <pic:cNvPr id="34" name="image-4ggVxp-mgO0FFh8OrhXaL.png" descr="Concurrency Conflict Tablet"/>
+                    <pic:cNvPr id="34" name="image-qL_gvi8uimh1T0fCldXhK.png" descr="Concurrency Conflict Tablet"/>
                     <pic:cNvPicPr/>
                   </pic:nvPicPr>
                   <pic:blipFill>
@@ -6728,12 +6728,12 @@
           <wp:inline distB="0" distL="0" distR="0" distT="0">
             <wp:extent cx="3571875" cy="6353175"/>
             <wp:effectExtent b="0" l="0" r="0" t="0"/>
-            <wp:docPr id="36" name="image-doxZ7yCHR3dxE9nMesid5.png"/>
+            <wp:docPr id="36" name="image-Zt4x1RitEZZjBhnQl2Tle.png"/>
             <a:graphic>
               <a:graphicData uri="http://schemas.openxmlformats.org/drawingml/2006/picture">
                 <pic:pic>
                   <pic:nvPicPr>
-                    <pic:cNvPr id="36" name="image-doxZ7yCHR3dxE9nMesid5.png" descr="Concurrency Conflict Mobile"/>
+                    <pic:cNvPr id="36" name="image-Zt4x1RitEZZjBhnQl2Tle.png" descr="Concurrency Conflict Mobile"/>
                     <pic:cNvPicPr/>
                   </pic:nvPicPr>
                   <pic:blipFill>
@@ -6805,12 +6805,12 @@
           <wp:inline distB="0" distL="0" distR="0" distT="0">
             <wp:extent cx="5486400" cy="3429000"/>
             <wp:effectExtent b="0" l="0" r="0" t="0"/>
-            <wp:docPr id="38" name="image-pXZApTLqj6IVkODrMAUpl.png"/>
+            <wp:docPr id="38" name="image-NLEhoubclv3pARIeqbHBI.png"/>
             <a:graphic>
               <a:graphicData uri="http://schemas.openxmlformats.org/drawingml/2006/picture">
                 <pic:pic>
                   <pic:nvPicPr>
-                    <pic:cNvPr id="38" name="image-pXZApTLqj6IVkODrMAUpl.png" descr="Requester Dashboard Desktop"/>
+                    <pic:cNvPr id="38" name="image-NLEhoubclv3pARIeqbHBI.png" descr="Requester Dashboard Desktop"/>
                     <pic:cNvPicPr/>
                   </pic:nvPicPr>
                   <pic:blipFill>
@@ -6853,12 +6853,12 @@
           <wp:inline distB="0" distL="0" distR="0" distT="0">
             <wp:extent cx="5486400" cy="7315200"/>
             <wp:effectExtent b="0" l="0" r="0" t="0"/>
-            <wp:docPr id="40" name="image-tV9WJYG-2GfjuJgn8CXyn.png"/>
+            <wp:docPr id="40" name="image-aCHY-cqpbs5h8zFfrKe6C.png"/>
             <a:graphic>
               <a:graphicData uri="http://schemas.openxmlformats.org/drawingml/2006/picture">
                 <pic:pic>
                   <pic:nvPicPr>
-                    <pic:cNvPr id="40" name="image-tV9WJYG-2GfjuJgn8CXyn.png" descr="Requester Dashboard Tablet"/>
+                    <pic:cNvPr id="40" name="image-aCHY-cqpbs5h8zFfrKe6C.png" descr="Requester Dashboard Tablet"/>
                     <pic:cNvPicPr/>
                   </pic:nvPicPr>
                   <pic:blipFill>
@@ -6901,12 +6901,12 @@
           <wp:inline distB="0" distL="0" distR="0" distT="0">
             <wp:extent cx="3571875" cy="6353175"/>
             <wp:effectExtent b="0" l="0" r="0" t="0"/>
-            <wp:docPr id="42" name="image-ybTC9k_qeQtBzbTasU0FF.png"/>
+            <wp:docPr id="42" name="image-VlujAHgs_BFk-JM9Pd9G8.png"/>
             <a:graphic>
               <a:graphicData uri="http://schemas.openxmlformats.org/drawingml/2006/picture">
                 <pic:pic>
                   <pic:nvPicPr>
-                    <pic:cNvPr id="42" name="image-ybTC9k_qeQtBzbTasU0FF.png" descr="Requester Dashboard Mobile"/>
+                    <pic:cNvPr id="42" name="image-VlujAHgs_BFk-JM9Pd9G8.png" descr="Requester Dashboard Mobile"/>
                     <pic:cNvPicPr/>
                   </pic:nvPicPr>
                   <pic:blipFill>
@@ -6959,12 +6959,12 @@
           <wp:inline distB="0" distL="0" distR="0" distT="0">
             <wp:extent cx="5486400" cy="3429000"/>
             <wp:effectExtent b="0" l="0" r="0" t="0"/>
-            <wp:docPr id="44" name="image-jMJLrqpsnVxCH-UruZmKQ.png"/>
+            <wp:docPr id="44" name="image-VgZHiEIHNVdpHmRMdLzCz.png"/>
             <a:graphic>
               <a:graphicData uri="http://schemas.openxmlformats.org/drawingml/2006/picture">
                 <pic:pic>
                   <pic:nvPicPr>
-                    <pic:cNvPr id="44" name="image-jMJLrqpsnVxCH-UruZmKQ.png" descr="Admin Dashboard Desktop"/>
+                    <pic:cNvPr id="44" name="image-VgZHiEIHNVdpHmRMdLzCz.png" descr="Admin Dashboard Desktop"/>
                     <pic:cNvPicPr/>
                   </pic:nvPicPr>
                   <pic:blipFill>
@@ -7007,12 +7007,12 @@
           <wp:inline distB="0" distL="0" distR="0" distT="0">
             <wp:extent cx="5486400" cy="7315200"/>
             <wp:effectExtent b="0" l="0" r="0" t="0"/>
-            <wp:docPr id="46" name="image-niK-2gxq2TH0nzhUTYuAG.png"/>
+            <wp:docPr id="46" name="image-CjFUd7jSCr8G1iVcFKnQE.png"/>
             <a:graphic>
               <a:graphicData uri="http://schemas.openxmlformats.org/drawingml/2006/picture">
                 <pic:pic>
                   <pic:nvPicPr>
-                    <pic:cNvPr id="46" name="image-niK-2gxq2TH0nzhUTYuAG.png" descr="Admin Dashboard Tablet"/>
+                    <pic:cNvPr id="46" name="image-CjFUd7jSCr8G1iVcFKnQE.png" descr="Admin Dashboard Tablet"/>
                     <pic:cNvPicPr/>
                   </pic:nvPicPr>
                   <pic:blipFill>
@@ -7055,12 +7055,12 @@
           <wp:inline distB="0" distL="0" distR="0" distT="0">
             <wp:extent cx="3571875" cy="6353175"/>
             <wp:effectExtent b="0" l="0" r="0" t="0"/>
-            <wp:docPr id="48" name="image-Xp1bVbuYpsiEl3MuNpQs-.png"/>
+            <wp:docPr id="48" name="image-0kVt0T0VNCURzm0U2BnRz.png"/>
             <a:graphic>
               <a:graphicData uri="http://schemas.openxmlformats.org/drawingml/2006/picture">
                 <pic:pic>
                   <pic:nvPicPr>
-                    <pic:cNvPr id="48" name="image-Xp1bVbuYpsiEl3MuNpQs-.png" descr="Admin Dashboard Mobile"/>
+                    <pic:cNvPr id="48" name="image-0kVt0T0VNCURzm0U2BnRz.png" descr="Admin Dashboard Mobile"/>
                     <pic:cNvPicPr/>
                   </pic:nvPicPr>
                   <pic:blipFill>

</xml_diff>

<commit_message>
fix(auth): respect verified JWT role claims in authGuard to enforce BR-22 400 on concurrent admin demotions (API-45b)
</commit_message>
<xml_diff>
--- a/artifacts/lab-04/CPE334_Lab4_Submission_67070503492.docx
+++ b/artifacts/lab-04/CPE334_Lab4_Submission_67070503492.docx
@@ -5614,12 +5614,12 @@
           <wp:inline distB="0" distL="0" distR="0" distT="0">
             <wp:extent cx="5486400" cy="3429000"/>
             <wp:effectExtent b="0" l="0" r="0" t="0"/>
-            <wp:docPr id="2" name="image-yQ5-Kr6cqnuuDanWCbDZO.png"/>
+            <wp:docPr id="2" name="image-tfvpm5L13kfPL2TFSMXbM.png"/>
             <a:graphic>
               <a:graphicData uri="http://schemas.openxmlformats.org/drawingml/2006/picture">
                 <pic:pic>
                   <pic:nvPicPr>
-                    <pic:cNvPr id="2" name="image-yQ5-Kr6cqnuuDanWCbDZO.png" descr="Staff Dashboard Desktop"/>
+                    <pic:cNvPr id="2" name="image-tfvpm5L13kfPL2TFSMXbM.png" descr="Staff Dashboard Desktop"/>
                     <pic:cNvPicPr/>
                   </pic:nvPicPr>
                   <pic:blipFill>
@@ -5662,12 +5662,12 @@
           <wp:inline distB="0" distL="0" distR="0" distT="0">
             <wp:extent cx="5486400" cy="7315200"/>
             <wp:effectExtent b="0" l="0" r="0" t="0"/>
-            <wp:docPr id="4" name="image-HVmS7-loHaaWTzIoDDqoM.png"/>
+            <wp:docPr id="4" name="image-YgDWnAfHvXNzJWYz-2IQm.png"/>
             <a:graphic>
               <a:graphicData uri="http://schemas.openxmlformats.org/drawingml/2006/picture">
                 <pic:pic>
                   <pic:nvPicPr>
-                    <pic:cNvPr id="4" name="image-HVmS7-loHaaWTzIoDDqoM.png" descr="Staff Dashboard Tablet"/>
+                    <pic:cNvPr id="4" name="image-YgDWnAfHvXNzJWYz-2IQm.png" descr="Staff Dashboard Tablet"/>
                     <pic:cNvPicPr/>
                   </pic:nvPicPr>
                   <pic:blipFill>
@@ -5710,12 +5710,12 @@
           <wp:inline distB="0" distL="0" distR="0" distT="0">
             <wp:extent cx="3571875" cy="6353175"/>
             <wp:effectExtent b="0" l="0" r="0" t="0"/>
-            <wp:docPr id="6" name="image-hG_bQjTnSP14dUtS8CwVC.png"/>
+            <wp:docPr id="6" name="image-veEBjpEb3UaBmNix_c-3G.png"/>
             <a:graphic>
               <a:graphicData uri="http://schemas.openxmlformats.org/drawingml/2006/picture">
                 <pic:pic>
                   <pic:nvPicPr>
-                    <pic:cNvPr id="6" name="image-hG_bQjTnSP14dUtS8CwVC.png" descr="Staff Dashboard Mobile"/>
+                    <pic:cNvPr id="6" name="image-veEBjpEb3UaBmNix_c-3G.png" descr="Staff Dashboard Mobile"/>
                     <pic:cNvPicPr/>
                   </pic:nvPicPr>
                   <pic:blipFill>
@@ -5908,12 +5908,12 @@
           <wp:inline distB="0" distL="0" distR="0" distT="0">
             <wp:extent cx="5486400" cy="3429000"/>
             <wp:effectExtent b="0" l="0" r="0" t="0"/>
-            <wp:docPr id="8" name="image-WEx_Nlic4kM0LJ8i9-P5n.png"/>
+            <wp:docPr id="8" name="image-KdpxRDnefXzXVvSRGEoHJ.png"/>
             <a:graphic>
               <a:graphicData uri="http://schemas.openxmlformats.org/drawingml/2006/picture">
                 <pic:pic>
                   <pic:nvPicPr>
-                    <pic:cNvPr id="8" name="image-WEx_Nlic4kM0LJ8i9-P5n.png" descr="Actions Taken Desktop"/>
+                    <pic:cNvPr id="8" name="image-KdpxRDnefXzXVvSRGEoHJ.png" descr="Actions Taken Desktop"/>
                     <pic:cNvPicPr/>
                   </pic:nvPicPr>
                   <pic:blipFill>
@@ -5956,12 +5956,12 @@
           <wp:inline distB="0" distL="0" distR="0" distT="0">
             <wp:extent cx="5486400" cy="7315200"/>
             <wp:effectExtent b="0" l="0" r="0" t="0"/>
-            <wp:docPr id="10" name="image-rg3G0DrjEaKmX5YSgh9xN.png"/>
+            <wp:docPr id="10" name="image-wmFQy340EB_zjd4_u12Lu.png"/>
             <a:graphic>
               <a:graphicData uri="http://schemas.openxmlformats.org/drawingml/2006/picture">
                 <pic:pic>
                   <pic:nvPicPr>
-                    <pic:cNvPr id="10" name="image-rg3G0DrjEaKmX5YSgh9xN.png" descr="Actions Taken Tablet"/>
+                    <pic:cNvPr id="10" name="image-wmFQy340EB_zjd4_u12Lu.png" descr="Actions Taken Tablet"/>
                     <pic:cNvPicPr/>
                   </pic:nvPicPr>
                   <pic:blipFill>
@@ -6004,12 +6004,12 @@
           <wp:inline distB="0" distL="0" distR="0" distT="0">
             <wp:extent cx="3571875" cy="6353175"/>
             <wp:effectExtent b="0" l="0" r="0" t="0"/>
-            <wp:docPr id="12" name="image-7oSbpBkHNo1a988Pl7p2v.png"/>
+            <wp:docPr id="12" name="image-j1-1N47cjtSrmwUC4-XsD.png"/>
             <a:graphic>
               <a:graphicData uri="http://schemas.openxmlformats.org/drawingml/2006/picture">
                 <pic:pic>
                   <pic:nvPicPr>
-                    <pic:cNvPr id="12" name="image-7oSbpBkHNo1a988Pl7p2v.png" descr="Actions Taken Mobile"/>
+                    <pic:cNvPr id="12" name="image-j1-1N47cjtSrmwUC4-XsD.png" descr="Actions Taken Mobile"/>
                     <pic:cNvPicPr/>
                   </pic:nvPicPr>
                   <pic:blipFill>
@@ -6062,12 +6062,12 @@
           <wp:inline distB="0" distL="0" distR="0" distT="0">
             <wp:extent cx="5486400" cy="3429000"/>
             <wp:effectExtent b="0" l="0" r="0" t="0"/>
-            <wp:docPr id="14" name="image-scsBr5NKiLNRXhOGaCssC.png"/>
+            <wp:docPr id="14" name="image-To-mYR9hoFQBO3Nqi1Zw3.png"/>
             <a:graphic>
               <a:graphicData uri="http://schemas.openxmlformats.org/drawingml/2006/picture">
                 <pic:pic>
                   <pic:nvPicPr>
-                    <pic:cNvPr id="14" name="image-scsBr5NKiLNRXhOGaCssC.png" descr="Action Taken Modal Desktop"/>
+                    <pic:cNvPr id="14" name="image-To-mYR9hoFQBO3Nqi1Zw3.png" descr="Action Taken Modal Desktop"/>
                     <pic:cNvPicPr/>
                   </pic:nvPicPr>
                   <pic:blipFill>
@@ -6110,12 +6110,12 @@
           <wp:inline distB="0" distL="0" distR="0" distT="0">
             <wp:extent cx="5486400" cy="7315200"/>
             <wp:effectExtent b="0" l="0" r="0" t="0"/>
-            <wp:docPr id="16" name="image-OdHsnTRdLcGn9qLe6npNe.png"/>
+            <wp:docPr id="16" name="image-AxrntaSIvNpABHJww7gPL.png"/>
             <a:graphic>
               <a:graphicData uri="http://schemas.openxmlformats.org/drawingml/2006/picture">
                 <pic:pic>
                   <pic:nvPicPr>
-                    <pic:cNvPr id="16" name="image-OdHsnTRdLcGn9qLe6npNe.png" descr="Action Taken Modal Tablet"/>
+                    <pic:cNvPr id="16" name="image-AxrntaSIvNpABHJww7gPL.png" descr="Action Taken Modal Tablet"/>
                     <pic:cNvPicPr/>
                   </pic:nvPicPr>
                   <pic:blipFill>
@@ -6158,12 +6158,12 @@
           <wp:inline distB="0" distL="0" distR="0" distT="0">
             <wp:extent cx="3571875" cy="6353175"/>
             <wp:effectExtent b="0" l="0" r="0" t="0"/>
-            <wp:docPr id="18" name="image-SR2YhGW5jq-V45VfM-erP.png"/>
+            <wp:docPr id="18" name="image-0qIy4kLUsW0Ua4e7ds244.png"/>
             <a:graphic>
               <a:graphicData uri="http://schemas.openxmlformats.org/drawingml/2006/picture">
                 <pic:pic>
                   <pic:nvPicPr>
-                    <pic:cNvPr id="18" name="image-SR2YhGW5jq-V45VfM-erP.png" descr="Action Taken Modal Mobile"/>
+                    <pic:cNvPr id="18" name="image-0qIy4kLUsW0Ua4e7ds244.png" descr="Action Taken Modal Mobile"/>
                     <pic:cNvPicPr/>
                   </pic:nvPicPr>
                   <pic:blipFill>
@@ -6324,12 +6324,12 @@
           <wp:inline distB="0" distL="0" distR="0" distT="0">
             <wp:extent cx="5486400" cy="3429000"/>
             <wp:effectExtent b="0" l="0" r="0" t="0"/>
-            <wp:docPr id="20" name="image-tYlfWTpTGM2qVczhtAVKL.png"/>
+            <wp:docPr id="20" name="image-Nuv-xmwQo1T5Tms8MHCy2.png"/>
             <a:graphic>
               <a:graphicData uri="http://schemas.openxmlformats.org/drawingml/2006/picture">
                 <pic:pic>
                   <pic:nvPicPr>
-                    <pic:cNvPr id="20" name="image-tYlfWTpTGM2qVczhtAVKL.png" descr="Resolution Gate Desktop"/>
+                    <pic:cNvPr id="20" name="image-Nuv-xmwQo1T5Tms8MHCy2.png" descr="Resolution Gate Desktop"/>
                     <pic:cNvPicPr/>
                   </pic:nvPicPr>
                   <pic:blipFill>
@@ -6372,12 +6372,12 @@
           <wp:inline distB="0" distL="0" distR="0" distT="0">
             <wp:extent cx="5486400" cy="7315200"/>
             <wp:effectExtent b="0" l="0" r="0" t="0"/>
-            <wp:docPr id="22" name="image-cOzrDMH9_Qffp_NTzyvth.png"/>
+            <wp:docPr id="22" name="image-VsFMdFVwVqlOCCNc8Zd2j.png"/>
             <a:graphic>
               <a:graphicData uri="http://schemas.openxmlformats.org/drawingml/2006/picture">
                 <pic:pic>
                   <pic:nvPicPr>
-                    <pic:cNvPr id="22" name="image-cOzrDMH9_Qffp_NTzyvth.png" descr="Resolution Gate Tablet"/>
+                    <pic:cNvPr id="22" name="image-VsFMdFVwVqlOCCNc8Zd2j.png" descr="Resolution Gate Tablet"/>
                     <pic:cNvPicPr/>
                   </pic:nvPicPr>
                   <pic:blipFill>
@@ -6420,12 +6420,12 @@
           <wp:inline distB="0" distL="0" distR="0" distT="0">
             <wp:extent cx="3571875" cy="6353175"/>
             <wp:effectExtent b="0" l="0" r="0" t="0"/>
-            <wp:docPr id="24" name="image-9qbSVQ53vUU0a882yROLM.png"/>
+            <wp:docPr id="24" name="image-veCyZM7q8GApk0wm457oa.png"/>
             <a:graphic>
               <a:graphicData uri="http://schemas.openxmlformats.org/drawingml/2006/picture">
                 <pic:pic>
                   <pic:nvPicPr>
-                    <pic:cNvPr id="24" name="image-9qbSVQ53vUU0a882yROLM.png" descr="Resolution Gate Mobile"/>
+                    <pic:cNvPr id="24" name="image-veCyZM7q8GApk0wm457oa.png" descr="Resolution Gate Mobile"/>
                     <pic:cNvPicPr/>
                   </pic:nvPicPr>
                   <pic:blipFill>
@@ -6478,12 +6478,12 @@
           <wp:inline distB="0" distL="0" distR="0" distT="0">
             <wp:extent cx="5486400" cy="3429000"/>
             <wp:effectExtent b="0" l="0" r="0" t="0"/>
-            <wp:docPr id="26" name="image-l_x_yEL_y6nSHUzlNRmZg.png"/>
+            <wp:docPr id="26" name="image--tkk895MozICuQNB75LbH.png"/>
             <a:graphic>
               <a:graphicData uri="http://schemas.openxmlformats.org/drawingml/2006/picture">
                 <pic:pic>
                   <pic:nvPicPr>
-                    <pic:cNvPr id="26" name="image-l_x_yEL_y6nSHUzlNRmZg.png" descr="Requester Resolve Desktop"/>
+                    <pic:cNvPr id="26" name="image--tkk895MozICuQNB75LbH.png" descr="Requester Resolve Desktop"/>
                     <pic:cNvPicPr/>
                   </pic:nvPicPr>
                   <pic:blipFill>
@@ -6526,12 +6526,12 @@
           <wp:inline distB="0" distL="0" distR="0" distT="0">
             <wp:extent cx="5486400" cy="7315200"/>
             <wp:effectExtent b="0" l="0" r="0" t="0"/>
-            <wp:docPr id="28" name="image-9C04bSqicY2Tg8RRMspwA.png"/>
+            <wp:docPr id="28" name="image-1gtOkiwLHSB5gcgDF7LG-.png"/>
             <a:graphic>
               <a:graphicData uri="http://schemas.openxmlformats.org/drawingml/2006/picture">
                 <pic:pic>
                   <pic:nvPicPr>
-                    <pic:cNvPr id="28" name="image-9C04bSqicY2Tg8RRMspwA.png" descr="Requester Resolve Tablet"/>
+                    <pic:cNvPr id="28" name="image-1gtOkiwLHSB5gcgDF7LG-.png" descr="Requester Resolve Tablet"/>
                     <pic:cNvPicPr/>
                   </pic:nvPicPr>
                   <pic:blipFill>
@@ -6574,12 +6574,12 @@
           <wp:inline distB="0" distL="0" distR="0" distT="0">
             <wp:extent cx="3571875" cy="6353175"/>
             <wp:effectExtent b="0" l="0" r="0" t="0"/>
-            <wp:docPr id="30" name="image-Kn4fbWJk3alM0iQdgvBS-.png"/>
+            <wp:docPr id="30" name="image-I3xwGrNybuqplf4OXQOm1.png"/>
             <a:graphic>
               <a:graphicData uri="http://schemas.openxmlformats.org/drawingml/2006/picture">
                 <pic:pic>
                   <pic:nvPicPr>
-                    <pic:cNvPr id="30" name="image-Kn4fbWJk3alM0iQdgvBS-.png" descr="Requester Resolve Mobile"/>
+                    <pic:cNvPr id="30" name="image-I3xwGrNybuqplf4OXQOm1.png" descr="Requester Resolve Mobile"/>
                     <pic:cNvPicPr/>
                   </pic:nvPicPr>
                   <pic:blipFill>
@@ -6632,12 +6632,12 @@
           <wp:inline distB="0" distL="0" distR="0" distT="0">
             <wp:extent cx="5486400" cy="3429000"/>
             <wp:effectExtent b="0" l="0" r="0" t="0"/>
-            <wp:docPr id="32" name="image-0C2yV7ZxUoFbyBz62qTlN.png"/>
+            <wp:docPr id="32" name="image-OstUwB98qRklSA9892C-I.png"/>
             <a:graphic>
               <a:graphicData uri="http://schemas.openxmlformats.org/drawingml/2006/picture">
                 <pic:pic>
                   <pic:nvPicPr>
-                    <pic:cNvPr id="32" name="image-0C2yV7ZxUoFbyBz62qTlN.png" descr="Concurrency Conflict Desktop"/>
+                    <pic:cNvPr id="32" name="image-OstUwB98qRklSA9892C-I.png" descr="Concurrency Conflict Desktop"/>
                     <pic:cNvPicPr/>
                   </pic:nvPicPr>
                   <pic:blipFill>
@@ -6680,12 +6680,12 @@
           <wp:inline distB="0" distL="0" distR="0" distT="0">
             <wp:extent cx="5486400" cy="7315200"/>
             <wp:effectExtent b="0" l="0" r="0" t="0"/>
-            <wp:docPr id="34" name="image-qL_gvi8uimh1T0fCldXhK.png"/>
+            <wp:docPr id="34" name="image-a6lxzHIeohuO28e6fMvBd.png"/>
             <a:graphic>
               <a:graphicData uri="http://schemas.openxmlformats.org/drawingml/2006/picture">
                 <pic:pic>
                   <pic:nvPicPr>
-                    <pic:cNvPr id="34" name="image-qL_gvi8uimh1T0fCldXhK.png" descr="Concurrency Conflict Tablet"/>
+                    <pic:cNvPr id="34" name="image-a6lxzHIeohuO28e6fMvBd.png" descr="Concurrency Conflict Tablet"/>
                     <pic:cNvPicPr/>
                   </pic:nvPicPr>
                   <pic:blipFill>
@@ -6728,12 +6728,12 @@
           <wp:inline distB="0" distL="0" distR="0" distT="0">
             <wp:extent cx="3571875" cy="6353175"/>
             <wp:effectExtent b="0" l="0" r="0" t="0"/>
-            <wp:docPr id="36" name="image-Zt4x1RitEZZjBhnQl2Tle.png"/>
+            <wp:docPr id="36" name="image-E_NdTsis30Wo8WJcr5G4s.png"/>
             <a:graphic>
               <a:graphicData uri="http://schemas.openxmlformats.org/drawingml/2006/picture">
                 <pic:pic>
                   <pic:nvPicPr>
-                    <pic:cNvPr id="36" name="image-Zt4x1RitEZZjBhnQl2Tle.png" descr="Concurrency Conflict Mobile"/>
+                    <pic:cNvPr id="36" name="image-E_NdTsis30Wo8WJcr5G4s.png" descr="Concurrency Conflict Mobile"/>
                     <pic:cNvPicPr/>
                   </pic:nvPicPr>
                   <pic:blipFill>
@@ -6805,12 +6805,12 @@
           <wp:inline distB="0" distL="0" distR="0" distT="0">
             <wp:extent cx="5486400" cy="3429000"/>
             <wp:effectExtent b="0" l="0" r="0" t="0"/>
-            <wp:docPr id="38" name="image-NLEhoubclv3pARIeqbHBI.png"/>
+            <wp:docPr id="38" name="image-goUfpRw7a360kkPCpELi7.png"/>
             <a:graphic>
               <a:graphicData uri="http://schemas.openxmlformats.org/drawingml/2006/picture">
                 <pic:pic>
                   <pic:nvPicPr>
-                    <pic:cNvPr id="38" name="image-NLEhoubclv3pARIeqbHBI.png" descr="Requester Dashboard Desktop"/>
+                    <pic:cNvPr id="38" name="image-goUfpRw7a360kkPCpELi7.png" descr="Requester Dashboard Desktop"/>
                     <pic:cNvPicPr/>
                   </pic:nvPicPr>
                   <pic:blipFill>
@@ -6853,12 +6853,12 @@
           <wp:inline distB="0" distL="0" distR="0" distT="0">
             <wp:extent cx="5486400" cy="7315200"/>
             <wp:effectExtent b="0" l="0" r="0" t="0"/>
-            <wp:docPr id="40" name="image-aCHY-cqpbs5h8zFfrKe6C.png"/>
+            <wp:docPr id="40" name="image-BOO1d1mjUU6C-y0D4DOAN.png"/>
             <a:graphic>
               <a:graphicData uri="http://schemas.openxmlformats.org/drawingml/2006/picture">
                 <pic:pic>
                   <pic:nvPicPr>
-                    <pic:cNvPr id="40" name="image-aCHY-cqpbs5h8zFfrKe6C.png" descr="Requester Dashboard Tablet"/>
+                    <pic:cNvPr id="40" name="image-BOO1d1mjUU6C-y0D4DOAN.png" descr="Requester Dashboard Tablet"/>
                     <pic:cNvPicPr/>
                   </pic:nvPicPr>
                   <pic:blipFill>
@@ -6901,12 +6901,12 @@
           <wp:inline distB="0" distL="0" distR="0" distT="0">
             <wp:extent cx="3571875" cy="6353175"/>
             <wp:effectExtent b="0" l="0" r="0" t="0"/>
-            <wp:docPr id="42" name="image-VlujAHgs_BFk-JM9Pd9G8.png"/>
+            <wp:docPr id="42" name="image-Va-ELXbOl5ozxMMVwR5Vw.png"/>
             <a:graphic>
               <a:graphicData uri="http://schemas.openxmlformats.org/drawingml/2006/picture">
                 <pic:pic>
                   <pic:nvPicPr>
-                    <pic:cNvPr id="42" name="image-VlujAHgs_BFk-JM9Pd9G8.png" descr="Requester Dashboard Mobile"/>
+                    <pic:cNvPr id="42" name="image-Va-ELXbOl5ozxMMVwR5Vw.png" descr="Requester Dashboard Mobile"/>
                     <pic:cNvPicPr/>
                   </pic:nvPicPr>
                   <pic:blipFill>
@@ -6959,12 +6959,12 @@
           <wp:inline distB="0" distL="0" distR="0" distT="0">
             <wp:extent cx="5486400" cy="3429000"/>
             <wp:effectExtent b="0" l="0" r="0" t="0"/>
-            <wp:docPr id="44" name="image-VgZHiEIHNVdpHmRMdLzCz.png"/>
+            <wp:docPr id="44" name="image-a_W7iPP4zYkoHz1lO7bQl.png"/>
             <a:graphic>
               <a:graphicData uri="http://schemas.openxmlformats.org/drawingml/2006/picture">
                 <pic:pic>
                   <pic:nvPicPr>
-                    <pic:cNvPr id="44" name="image-VgZHiEIHNVdpHmRMdLzCz.png" descr="Admin Dashboard Desktop"/>
+                    <pic:cNvPr id="44" name="image-a_W7iPP4zYkoHz1lO7bQl.png" descr="Admin Dashboard Desktop"/>
                     <pic:cNvPicPr/>
                   </pic:nvPicPr>
                   <pic:blipFill>
@@ -7007,12 +7007,12 @@
           <wp:inline distB="0" distL="0" distR="0" distT="0">
             <wp:extent cx="5486400" cy="7315200"/>
             <wp:effectExtent b="0" l="0" r="0" t="0"/>
-            <wp:docPr id="46" name="image-CjFUd7jSCr8G1iVcFKnQE.png"/>
+            <wp:docPr id="46" name="image-X4ZkCicwSCJQjWdFnWn73.png"/>
             <a:graphic>
               <a:graphicData uri="http://schemas.openxmlformats.org/drawingml/2006/picture">
                 <pic:pic>
                   <pic:nvPicPr>
-                    <pic:cNvPr id="46" name="image-CjFUd7jSCr8G1iVcFKnQE.png" descr="Admin Dashboard Tablet"/>
+                    <pic:cNvPr id="46" name="image-X4ZkCicwSCJQjWdFnWn73.png" descr="Admin Dashboard Tablet"/>
                     <pic:cNvPicPr/>
                   </pic:nvPicPr>
                   <pic:blipFill>
@@ -7055,12 +7055,12 @@
           <wp:inline distB="0" distL="0" distR="0" distT="0">
             <wp:extent cx="3571875" cy="6353175"/>
             <wp:effectExtent b="0" l="0" r="0" t="0"/>
-            <wp:docPr id="48" name="image-0kVt0T0VNCURzm0U2BnRz.png"/>
+            <wp:docPr id="48" name="image-odR5JLp41bKqpwDLZSaHr.png"/>
             <a:graphic>
               <a:graphicData uri="http://schemas.openxmlformats.org/drawingml/2006/picture">
                 <pic:pic>
                   <pic:nvPicPr>
-                    <pic:cNvPr id="48" name="image-0kVt0T0VNCURzm0U2BnRz.png" descr="Admin Dashboard Mobile"/>
+                    <pic:cNvPr id="48" name="image-odR5JLp41bKqpwDLZSaHr.png" descr="Admin Dashboard Mobile"/>
                     <pic:cNvPicPr/>
                   </pic:nvPicPr>
                   <pic:blipFill>

</xml_diff>